<commit_message>
Ajustes del sistema - cambios de la base empleado para que funcione igual que ica y condiciones de placeholders
</commit_message>
<xml_diff>
--- a/public/Carta cuenta de cobro.docx
+++ b/public/Carta cuenta de cobro.docx
@@ -16,7 +16,15 @@
           <w:b/>
           <w:bCs/>
         </w:rPr>
-        <w:t xml:space="preserve">Bogotá D.C., </w:t>
+        <w:t>@@DEPARTAMENTO@@</w:t>
+      </w:r>
+      <w:r>
+        <w:rPr>
+          <w:rFonts w:asciiTheme="minorHAnsi" w:eastAsia="Arial" w:hAnsiTheme="minorHAnsi" w:cs="Arial"/>
+          <w:b/>
+          <w:bCs/>
+        </w:rPr>
+        <w:t xml:space="preserve">., </w:t>
       </w:r>
       <w:r>
         <w:rPr>
@@ -55,7 +63,31 @@
           <w:sz w:val="32"/>
           <w:szCs w:val="32"/>
         </w:rPr>
-        <w:t xml:space="preserve">CUENTA DE COBRO N°: </w:t>
+        <w:t xml:space="preserve">CUENTA DE COBRO </w:t>
+      </w:r>
+      <w:proofErr w:type="spellStart"/>
+      <w:r>
+        <w:rPr>
+          <w:rFonts w:asciiTheme="minorHAnsi" w:eastAsia="Arial" w:hAnsiTheme="minorHAnsi" w:cs="Arial"/>
+          <w:b/>
+          <w:bCs/>
+          <w:color w:val="1B3A6B"/>
+          <w:sz w:val="32"/>
+          <w:szCs w:val="32"/>
+        </w:rPr>
+        <w:t>N°</w:t>
+      </w:r>
+      <w:proofErr w:type="spellEnd"/>
+      <w:r>
+        <w:rPr>
+          <w:rFonts w:asciiTheme="minorHAnsi" w:eastAsia="Arial" w:hAnsiTheme="minorHAnsi" w:cs="Arial"/>
+          <w:b/>
+          <w:bCs/>
+          <w:color w:val="1B3A6B"/>
+          <w:sz w:val="32"/>
+          <w:szCs w:val="32"/>
+        </w:rPr>
+        <w:t xml:space="preserve">: </w:t>
       </w:r>
       <w:r>
         <w:rPr>
@@ -674,6 +706,7 @@
                 <w:rFonts w:asciiTheme="minorHAnsi" w:hAnsiTheme="minorHAnsi"/>
               </w:rPr>
             </w:pPr>
+            <w:proofErr w:type="gramStart"/>
             <w:r>
               <w:rPr>
                 <w:rFonts w:asciiTheme="minorHAnsi" w:eastAsia="Arial" w:hAnsiTheme="minorHAnsi" w:cs="Arial"/>
@@ -682,7 +715,18 @@
                 <w:sz w:val="22"/>
                 <w:szCs w:val="22"/>
               </w:rPr>
-              <w:t>TOTAL A PAGAR</w:t>
+              <w:t>TOTAL</w:t>
+            </w:r>
+            <w:proofErr w:type="gramEnd"/>
+            <w:r>
+              <w:rPr>
+                <w:rFonts w:asciiTheme="minorHAnsi" w:eastAsia="Arial" w:hAnsiTheme="minorHAnsi" w:cs="Arial"/>
+                <w:b/>
+                <w:bCs/>
+                <w:sz w:val="22"/>
+                <w:szCs w:val="22"/>
+              </w:rPr>
+              <w:t xml:space="preserve"> A PAGAR</w:t>
             </w:r>
           </w:p>
         </w:tc>
@@ -970,13 +1014,23 @@
           <w:szCs w:val="16"/>
         </w:rPr>
       </w:pPr>
+      <w:proofErr w:type="gramStart"/>
       <w:r>
         <w:rPr>
           <w:rFonts w:asciiTheme="minorHAnsi" w:hAnsiTheme="minorHAnsi"/>
           <w:sz w:val="16"/>
           <w:szCs w:val="16"/>
         </w:rPr>
-        <w:t>De acuerdo a la reforma tributaria (Ley1819); Certifico bajo la gravedad de juramento que no tengo subcontratados a más de dos personas naturales asociados a esta actividad por lo que solicito aplicar la depuración del ART. 383 del E.T. para efectos de la retención en la fuente.</w:t>
+        <w:t>De acuerdo a</w:t>
+      </w:r>
+      <w:proofErr w:type="gramEnd"/>
+      <w:r>
+        <w:rPr>
+          <w:rFonts w:asciiTheme="minorHAnsi" w:hAnsiTheme="minorHAnsi"/>
+          <w:sz w:val="16"/>
+          <w:szCs w:val="16"/>
+        </w:rPr>
+        <w:t xml:space="preserve"> la reforma tributaria (Ley1819); Certifico bajo la gravedad de juramento que no tengo subcontratados a más de dos personas naturales asociados a esta actividad por lo que solicito aplicar la depuración del ART. 383 del E.T. para efectos de la retención en la fuente.</w:t>
       </w:r>
     </w:p>
     <w:p>
@@ -1629,6 +1683,7 @@
   <w:style w:type="character" w:default="1" w:styleId="Fuentedeprrafopredeter">
     <w:name w:val="Default Paragraph Font"/>
     <w:uiPriority w:val="1"/>
+    <w:semiHidden/>
     <w:unhideWhenUsed/>
   </w:style>
   <w:style w:type="table" w:default="1" w:styleId="Tablanormal">

</xml_diff>